<commit_message>
feat(sim): add SNR/overhead/SE simulation sweep scripts and metrics
- Add AWGN noise injection (src/utils/channel_noise.py) and wire into
  FddCsiDataset for eval-time UL input and DL sparse pilots.
- Add spectral_efficiency metric to src/utils/metrics.py.
- Add full_feedback baseline to src/utils/baselines.py.
- Add sampling mask factory / overhead-to-spacing helpers to
  src/models/sampling_mask.py with energy/random peak modes.
- Add use_magnitude scaffold to PhaseRecoveryNetwork for no-magnitude ablation.
- Add unified scripts/run_simulation.py for nmse_snr, se_snr,
  nmse_overhead, and fair sampling_overhead ablations.
- Add config_ckpt.yaml reverse-engineered to match trained checkpoints.
- Extend config.yaml with simulation section.
- Update CLAUDE.md and add researchPlan/simRun.md.

Co-Authored-By: Claude Opus 4.8 <noreply@anthropic.com>
</commit_message>
<xml_diff>
--- a/researchPlan/research_plan.docx
+++ b/researchPlan/research_plan.docx
@@ -1212,11 +1212,6 @@
       </w:r>
     </w:p>
     <w:p>
-      <w:pPr>
-        <w:rPr>
-          <w:rFonts w:hint="eastAsia"/>
-        </w:rPr>
-      </w:pPr>
       <w:r>
         <w:rPr>
           <w:rFonts w:hint="eastAsia"/>
@@ -1228,11 +1223,6 @@
       </w:r>
     </w:p>
     <w:p>
-      <w:pPr>
-        <w:rPr>
-          <w:rFonts w:hint="eastAsia"/>
-        </w:rPr>
-      </w:pPr>
       <w:r>
         <w:rPr>
           <w:rFonts w:hint="eastAsia"/>
@@ -1274,11 +1264,6 @@
       </w:r>
     </w:p>
     <w:p>
-      <w:pPr>
-        <w:rPr>
-          <w:rFonts w:hint="eastAsia"/>
-        </w:rPr>
-      </w:pPr>
       <w:r>
         <w:rPr>
           <w:rFonts w:hint="eastAsia"/>
@@ -1290,11 +1275,6 @@
       </w:r>
     </w:p>
     <w:p>
-      <w:pPr>
-        <w:rPr>
-          <w:rFonts w:hint="eastAsia"/>
-        </w:rPr>
-      </w:pPr>
       <w:r>
         <w:rPr>
           <w:rFonts w:hint="eastAsia"/>
@@ -1498,11 +1478,6 @@
       </w:r>
     </w:p>
     <w:p>
-      <w:pPr>
-        <w:rPr>
-          <w:rFonts w:hint="eastAsia"/>
-        </w:rPr>
-      </w:pPr>
       <w:r>
         <w:rPr>
           <w:noProof/>
@@ -1570,11 +1545,6 @@
       </w:r>
     </w:p>
     <w:p>
-      <w:pPr>
-        <w:rPr>
-          <w:rFonts w:hint="eastAsia"/>
-        </w:rPr>
-      </w:pPr>
       <w:r>
         <w:rPr>
           <w:rFonts w:hint="eastAsia"/>
@@ -1588,9 +1558,6 @@
     <w:p>
       <w:pPr>
         <w:ind w:firstLine="420"/>
-        <w:rPr>
-          <w:rFonts w:hint="eastAsia"/>
-        </w:rPr>
       </w:pPr>
       <w:r>
         <w:rPr>
@@ -1603,11 +1570,6 @@
       </w:r>
     </w:p>
     <w:p>
-      <w:pPr>
-        <w:rPr>
-          <w:rFonts w:hint="eastAsia"/>
-        </w:rPr>
-      </w:pPr>
       <w:r>
         <w:rPr>
           <w:rFonts w:hint="eastAsia"/>
@@ -1705,11 +1667,6 @@
       </w:r>
     </w:p>
     <w:p>
-      <w:pPr>
-        <w:rPr>
-          <w:rFonts w:hint="eastAsia"/>
-        </w:rPr>
-      </w:pPr>
       <w:r>
         <w:t>BS 可以根据预测的 DL 功率分布判断：</w:t>
       </w:r>
@@ -1783,11 +1740,6 @@
       </w:r>
     </w:p>
     <w:p>
-      <w:pPr>
-        <w:rPr>
-          <w:rFonts w:hint="eastAsia"/>
-        </w:rPr>
-      </w:pPr>
       <w:r>
         <w:rPr>
           <w:rFonts w:hint="eastAsia"/>
@@ -1799,11 +1751,6 @@
       </w:r>
     </w:p>
     <w:p>
-      <w:pPr>
-        <w:rPr>
-          <w:rFonts w:hint="eastAsia"/>
-        </w:rPr>
-      </w:pPr>
       <w:r>
         <w:rPr>
           <w:rFonts w:hint="eastAsia"/>
@@ -1868,11 +1815,6 @@
       </w:r>
     </w:p>
     <w:p>
-      <w:pPr>
-        <w:rPr>
-          <w:rFonts w:hint="eastAsia"/>
-        </w:rPr>
-      </w:pPr>
       <w:r>
         <w:rPr>
           <w:rFonts w:hint="eastAsia"/>
@@ -1917,11 +1859,6 @@
       </w:r>
     </w:p>
     <w:p>
-      <w:pPr>
-        <w:rPr>
-          <w:rFonts w:hint="eastAsia"/>
-        </w:rPr>
-      </w:pPr>
       <w:r>
         <w:rPr>
           <w:rFonts w:hint="eastAsia"/>
@@ -1995,11 +1932,6 @@
       </w:r>
     </w:p>
     <w:p>
-      <w:pPr>
-        <w:rPr>
-          <w:rFonts w:hint="eastAsia"/>
-        </w:rPr>
-      </w:pPr>
       <w:r>
         <w:rPr>
           <w:rFonts w:hint="eastAsia"/>
@@ -2062,11 +1994,6 @@
       </w:r>
     </w:p>
     <w:p>
-      <w:pPr>
-        <w:rPr>
-          <w:rFonts w:hint="eastAsia"/>
-        </w:rPr>
-      </w:pPr>
       <w:r>
         <w:rPr>
           <w:rFonts w:hint="eastAsia"/>
@@ -2357,11 +2284,6 @@
       </w:r>
     </w:p>
     <w:p>
-      <w:pPr>
-        <w:rPr>
-          <w:rFonts w:hint="eastAsia"/>
-        </w:rPr>
-      </w:pPr>
       <w:r>
         <w:rPr>
           <w:rFonts w:hint="eastAsia"/>
@@ -2827,13 +2749,7 @@
         </w:tc>
       </w:tr>
     </w:tbl>
-    <w:p>
-      <w:pPr>
-        <w:rPr>
-          <w:rFonts w:hint="eastAsia"/>
-        </w:rPr>
-      </w:pPr>
-    </w:p>
+    <w:p/>
     <w:p>
       <w:pPr>
         <w:pStyle w:val="a9"/>
@@ -2841,9 +2757,6 @@
           <w:ilvl w:val="0"/>
           <w:numId w:val="15"/>
         </w:numPr>
-        <w:rPr>
-          <w:rFonts w:hint="eastAsia"/>
-        </w:rPr>
       </w:pPr>
       <w:r>
         <w:t>输入表示：角度-延迟域</w:t>
@@ -2909,11 +2822,6 @@
       </w:r>
     </w:p>
     <w:p>
-      <w:pPr>
-        <w:rPr>
-          <w:rFonts w:hint="eastAsia"/>
-        </w:rPr>
-      </w:pPr>
       <w:r>
         <w:rPr>
           <w:rFonts w:hint="eastAsia"/>
@@ -2973,9 +2881,6 @@
           <w:ilvl w:val="0"/>
           <w:numId w:val="17"/>
         </w:numPr>
-        <w:rPr>
-          <w:rFonts w:hint="eastAsia"/>
-        </w:rPr>
       </w:pPr>
       <w:r>
         <w:rPr>
@@ -2999,11 +2904,6 @@
       </w:r>
     </w:p>
     <w:p>
-      <w:pPr>
-        <w:rPr>
-          <w:rFonts w:hint="eastAsia"/>
-        </w:rPr>
-      </w:pPr>
       <w:r>
         <w:rPr>
           <w:rFonts w:hint="eastAsia"/>
@@ -3015,11 +2915,6 @@
       </w:r>
     </w:p>
     <w:p>
-      <w:pPr>
-        <w:rPr>
-          <w:rFonts w:hint="eastAsia"/>
-        </w:rPr>
-      </w:pPr>
       <w:r>
         <w:rPr>
           <w:rFonts w:hint="eastAsia"/>
@@ -3043,11 +2938,6 @@
     </w:p>
     <w:p/>
     <w:p>
-      <w:pPr>
-        <w:rPr>
-          <w:rFonts w:hint="eastAsia"/>
-        </w:rPr>
-      </w:pPr>
       <w:r>
         <w:rPr>
           <w:rFonts w:hint="eastAsia"/>
@@ -3156,11 +3046,6 @@
       </w:r>
     </w:p>
     <w:p>
-      <w:pPr>
-        <w:rPr>
-          <w:rFonts w:hint="eastAsia"/>
-        </w:rPr>
-      </w:pPr>
       <w:r>
         <w:rPr>
           <w:rFonts w:hint="eastAsia"/>
@@ -3172,11 +3057,6 @@
       </w:r>
     </w:p>
     <w:p>
-      <w:pPr>
-        <w:rPr>
-          <w:rFonts w:hint="eastAsia"/>
-        </w:rPr>
-      </w:pPr>
       <w:r>
         <w:rPr>
           <w:rFonts w:hint="eastAsia"/>
@@ -3188,11 +3068,6 @@
       </w:r>
     </w:p>
     <w:p>
-      <w:pPr>
-        <w:rPr>
-          <w:rFonts w:hint="eastAsia"/>
-        </w:rPr>
-      </w:pPr>
       <w:r>
         <w:rPr>
           <w:rFonts w:hint="eastAsia"/>
@@ -3204,11 +3079,6 @@
       </w:r>
     </w:p>
     <w:p>
-      <w:pPr>
-        <w:rPr>
-          <w:rFonts w:hint="eastAsia"/>
-        </w:rPr>
-      </w:pPr>
       <w:r>
         <w:rPr>
           <w:rFonts w:hint="eastAsia"/>
@@ -3362,11 +3232,6 @@
       </w:r>
     </w:p>
     <w:p>
-      <w:pPr>
-        <w:rPr>
-          <w:rFonts w:hint="eastAsia"/>
-        </w:rPr>
-      </w:pPr>
       <w:r>
         <w:rPr>
           <w:rFonts w:hint="eastAsia"/>
@@ -3378,11 +3243,6 @@
       </w:r>
     </w:p>
     <w:p>
-      <w:pPr>
-        <w:rPr>
-          <w:rFonts w:hint="eastAsia"/>
-        </w:rPr>
-      </w:pPr>
       <w:r>
         <w:rPr>
           <w:rFonts w:hint="eastAsia"/>
@@ -3394,11 +3254,6 @@
       </w:r>
     </w:p>
     <w:p>
-      <w:pPr>
-        <w:rPr>
-          <w:rFonts w:hint="eastAsia"/>
-        </w:rPr>
-      </w:pPr>
       <w:r>
         <w:rPr>
           <w:rFonts w:hint="eastAsia"/>
@@ -3410,11 +3265,6 @@
       </w:r>
     </w:p>
     <w:p>
-      <w:pPr>
-        <w:rPr>
-          <w:rFonts w:hint="eastAsia"/>
-        </w:rPr>
-      </w:pPr>
       <w:r>
         <w:rPr>
           <w:rFonts w:hint="eastAsia"/>
@@ -3464,11 +3314,6 @@
       </w:r>
     </w:p>
     <w:p>
-      <w:pPr>
-        <w:rPr>
-          <w:rFonts w:hint="eastAsia"/>
-        </w:rPr>
-      </w:pPr>
       <w:r>
         <w:rPr>
           <w:rFonts w:hint="eastAsia"/>
@@ -3561,11 +3406,6 @@
       </w:r>
     </w:p>
     <w:p>
-      <w:pPr>
-        <w:rPr>
-          <w:rFonts w:hint="eastAsia"/>
-        </w:rPr>
-      </w:pPr>
       <w:r>
         <w:rPr>
           <w:rFonts w:hint="eastAsia"/>
@@ -3577,11 +3417,6 @@
       </w:r>
     </w:p>
     <w:p>
-      <w:pPr>
-        <w:rPr>
-          <w:rFonts w:hint="eastAsia"/>
-        </w:rPr>
-      </w:pPr>
       <w:r>
         <w:rPr>
           <w:rFonts w:hint="eastAsia"/>
@@ -3651,11 +3486,6 @@
       </w:r>
     </w:p>
     <w:p>
-      <w:pPr>
-        <w:rPr>
-          <w:rFonts w:hint="eastAsia"/>
-        </w:rPr>
-      </w:pPr>
       <w:r>
         <w:rPr>
           <w:rFonts w:hint="eastAsia"/>
@@ -3667,11 +3497,6 @@
       </w:r>
     </w:p>
     <w:p>
-      <w:pPr>
-        <w:rPr>
-          <w:rFonts w:hint="eastAsia"/>
-        </w:rPr>
-      </w:pPr>
       <w:r>
         <w:rPr>
           <w:rFonts w:hint="eastAsia"/>
@@ -3683,11 +3508,6 @@
       </w:r>
     </w:p>
     <w:p>
-      <w:pPr>
-        <w:rPr>
-          <w:rFonts w:hint="eastAsia"/>
-        </w:rPr>
-      </w:pPr>
       <w:r>
         <w:rPr>
           <w:rFonts w:hint="eastAsia"/>
@@ -3699,11 +3519,6 @@
       </w:r>
     </w:p>
     <w:p>
-      <w:pPr>
-        <w:rPr>
-          <w:rFonts w:hint="eastAsia"/>
-        </w:rPr>
-      </w:pPr>
       <w:r>
         <w:rPr>
           <w:rFonts w:hint="eastAsia"/>
@@ -3794,11 +3609,6 @@
       </w:r>
     </w:p>
     <w:p>
-      <w:pPr>
-        <w:rPr>
-          <w:rFonts w:hint="eastAsia"/>
-        </w:rPr>
-      </w:pPr>
       <w:r>
         <w:rPr>
           <w:rFonts w:hint="eastAsia"/>
@@ -3811,11 +3621,6 @@
       </w:r>
     </w:p>
     <w:p>
-      <w:pPr>
-        <w:rPr>
-          <w:rFonts w:hint="eastAsia"/>
-        </w:rPr>
-      </w:pPr>
       <w:r>
         <w:rPr>
           <w:rFonts w:hint="eastAsia"/>
@@ -3827,11 +3632,6 @@
       </w:r>
     </w:p>
     <w:p>
-      <w:pPr>
-        <w:rPr>
-          <w:rFonts w:hint="eastAsia"/>
-        </w:rPr>
-      </w:pPr>
       <w:r>
         <w:rPr>
           <w:rFonts w:hint="eastAsia"/>
@@ -3843,11 +3643,6 @@
       </w:r>
     </w:p>
     <w:p>
-      <w:pPr>
-        <w:rPr>
-          <w:rFonts w:hint="eastAsia"/>
-        </w:rPr>
-      </w:pPr>
       <w:r>
         <w:rPr>
           <w:rFonts w:hint="eastAsia"/>
@@ -3938,11 +3733,6 @@
       </w:r>
     </w:p>
     <w:p>
-      <w:pPr>
-        <w:rPr>
-          <w:rFonts w:hint="eastAsia"/>
-        </w:rPr>
-      </w:pPr>
       <w:r>
         <w:rPr>
           <w:rFonts w:hint="eastAsia"/>
@@ -3961,11 +3751,6 @@
       </w:r>
     </w:p>
     <w:p>
-      <w:pPr>
-        <w:rPr>
-          <w:rFonts w:hint="eastAsia"/>
-        </w:rPr>
-      </w:pPr>
       <w:r>
         <w:t>large_scale:       [B, 6]</w:t>
       </w:r>
@@ -3981,11 +3766,6 @@
       </w:r>
     </w:p>
     <w:p>
-      <w:pPr>
-        <w:rPr>
-          <w:rFonts w:hint="eastAsia"/>
-        </w:rPr>
-      </w:pPr>
       <w:r>
         <w:t>history_ul_ri:     [B, 16, 2, 32, 4, 32]</w:t>
       </w:r>
@@ -3996,11 +3776,6 @@
       </w:r>
     </w:p>
     <w:p>
-      <w:pPr>
-        <w:rPr>
-          <w:rFonts w:hint="eastAsia"/>
-        </w:rPr>
-      </w:pPr>
       <w:r>
         <w:t>current_feat:      [B, 512]</w:t>
       </w:r>
@@ -4011,11 +3786,6 @@
       </w:r>
     </w:p>
     <w:p>
-      <w:pPr>
-        <w:rPr>
-          <w:rFonts w:hint="eastAsia"/>
-        </w:rPr>
-      </w:pPr>
       <w:r>
         <w:t>temporal_feat:     [B, 512]</w:t>
       </w:r>
@@ -4026,11 +3796,6 @@
       </w:r>
     </w:p>
     <w:p>
-      <w:pPr>
-        <w:rPr>
-          <w:rFonts w:hint="eastAsia"/>
-        </w:rPr>
-      </w:pPr>
       <w:r>
         <w:t>env_feat:          [B, 512]</w:t>
       </w:r>
@@ -4041,11 +3806,6 @@
       </w:r>
     </w:p>
     <w:p>
-      <w:pPr>
-        <w:rPr>
-          <w:rFonts w:hint="eastAsia"/>
-        </w:rPr>
-      </w:pPr>
       <w:r>
         <w:t>tokens:            [B, 3, 512]</w:t>
       </w:r>
@@ -4056,11 +3816,6 @@
       </w:r>
     </w:p>
     <w:p>
-      <w:pPr>
-        <w:rPr>
-          <w:rFonts w:hint="eastAsia"/>
-        </w:rPr>
-      </w:pPr>
       <w:r>
         <w:lastRenderedPageBreak/>
         <w:t>transformer_out:   [B, 3, 512]</w:t>
@@ -4072,11 +3827,6 @@
       </w:r>
     </w:p>
     <w:p>
-      <w:pPr>
-        <w:rPr>
-          <w:rFonts w:hint="eastAsia"/>
-        </w:rPr>
-      </w:pPr>
       <w:r>
         <w:t>pooled:            [B, 512]</w:t>
       </w:r>
@@ -4097,11 +3847,6 @@
       </w:r>
     </w:p>
     <w:p>
-      <w:pPr>
-        <w:rPr>
-          <w:rFonts w:hint="eastAsia"/>
-        </w:rPr>
-      </w:pPr>
       <w:r>
         <w:t>config.yaml 里当前损失以 幅度 MSE 为主：</w:t>
       </w:r>
@@ -4244,20 +3989,11 @@
     </w:p>
     <w:p/>
     <w:p/>
-    <w:p>
-      <w:pPr>
-        <w:rPr>
-          <w:rFonts w:hint="eastAsia"/>
-        </w:rPr>
-      </w:pPr>
-    </w:p>
+    <w:p/>
     <w:p>
       <w:pPr>
         <w:pStyle w:val="a9"/>
         <w:ind w:left="440"/>
-        <w:rPr>
-          <w:rFonts w:hint="eastAsia"/>
-        </w:rPr>
       </w:pPr>
     </w:p>
     <w:p>
@@ -4335,9 +4071,6 @@
           <w:ilvl w:val="0"/>
           <w:numId w:val="28"/>
         </w:numPr>
-        <w:rPr>
-          <w:rFonts w:hint="eastAsia"/>
-        </w:rPr>
       </w:pPr>
       <w:r>
         <w:t>时间序列信道预测</w:t>
@@ -4401,16 +4134,104 @@
       </w:r>
     </w:p>
     <w:p>
-      <w:pPr>
-        <w:rPr>
-          <w:rFonts w:hint="eastAsia"/>
-        </w:rPr>
-      </w:pPr>
       <w:r>
         <w:rPr>
           <w:rFonts w:hint="eastAsia"/>
         </w:rPr>
         <w:t>3.预测下行CSI的工作是在基站侧做的，下行导频反馈是先由基站通过下行信道发送导频，UE侧基于下行导频估计下行CSI相位反馈给基站吗？下行导频反馈实际的具体流程是怎么样的呢</w:t>
+      </w:r>
+    </w:p>
+    <w:p/>
+    <w:p/>
+    <w:p/>
+    <w:p/>
+    <w:p>
+      <w:pPr>
+        <w:widowControl/>
+      </w:pPr>
+      <w:r>
+        <w:br w:type="page"/>
+      </w:r>
+    </w:p>
+    <w:p>
+      <w:r>
+        <w:rPr>
+          <w:rFonts w:hint="eastAsia"/>
+        </w:rPr>
+        <w:lastRenderedPageBreak/>
+        <w:t>目前已经完成两个阶段的网络模型训练，准备补充仿真进行结果统计</w:t>
+      </w:r>
+      <w:r>
+        <w:rPr>
+          <w:rFonts w:hint="eastAsia"/>
+        </w:rPr>
+        <w:t>，</w:t>
+      </w:r>
+      <w:r>
+        <w:t>我目前想完成simPlan.md中的1.1、1.2、1.3、2.1和2.2的仿真计划</w:t>
+      </w:r>
+      <w:r>
+        <w:rPr>
+          <w:rFonts w:hint="eastAsia"/>
+        </w:rPr>
+        <w:t>，目前的代码是否支持这些仿真，如果不支持，帮我补充相关代码，如果想要完成这些仿真应该这么做</w:t>
+      </w:r>
+    </w:p>
+    <w:p/>
+    <w:p>
+      <w:r>
+        <w:rPr>
+          <w:rFonts w:hint="eastAsia"/>
+        </w:rPr>
+        <w:t>仿真问题：</w:t>
+      </w:r>
+    </w:p>
+    <w:p>
+      <w:pPr>
+        <w:pStyle w:val="a9"/>
+        <w:numPr>
+          <w:ilvl w:val="0"/>
+          <w:numId w:val="31"/>
+        </w:numPr>
+      </w:pPr>
+      <w:r>
+        <w:rPr>
+          <w:rFonts w:hint="eastAsia"/>
+        </w:rPr>
+        <w:t>低SNR属于ODD是否需要重新训练</w:t>
+      </w:r>
+    </w:p>
+    <w:p>
+      <w:pPr>
+        <w:pStyle w:val="a9"/>
+        <w:numPr>
+          <w:ilvl w:val="0"/>
+          <w:numId w:val="31"/>
+        </w:numPr>
+      </w:pPr>
+      <w:r>
+        <w:rPr>
+          <w:rFonts w:hint="eastAsia"/>
+        </w:rPr>
+        <w:t>均匀采样/非均匀采样的公平性问题</w:t>
+      </w:r>
+    </w:p>
+    <w:p>
+      <w:pPr>
+        <w:pStyle w:val="a9"/>
+        <w:numPr>
+          <w:ilvl w:val="0"/>
+          <w:numId w:val="31"/>
+        </w:numPr>
+        <w:rPr>
+          <w:rFonts w:hint="eastAsia"/>
+        </w:rPr>
+      </w:pPr>
+      <w:r>
+        <w:rPr>
+          <w:rFonts w:hint="eastAsia"/>
+        </w:rPr>
+        <w:t>跑overhead时候子载波数太少了，是否要改为64*8*64的数据重新训练</w:t>
       </w:r>
     </w:p>
     <w:sectPr>
@@ -5579,6 +5400,95 @@
     </w:lvl>
   </w:abstractNum>
   <w:abstractNum w:abstractNumId="10" w15:restartNumberingAfterBreak="0">
+    <w:nsid w:val="34B01173"/>
+    <w:multiLevelType w:val="hybridMultilevel"/>
+    <w:tmpl w:val="513A7098"/>
+    <w:lvl w:ilvl="0" w:tplc="043CB3A4">
+      <w:start w:val="1"/>
+      <w:numFmt w:val="decimal"/>
+      <w:lvlText w:val="%1."/>
+      <w:lvlJc w:val="left"/>
+      <w:pPr>
+        <w:ind w:left="360" w:hanging="360"/>
+      </w:pPr>
+      <w:rPr>
+        <w:rFonts w:hint="default"/>
+      </w:rPr>
+    </w:lvl>
+    <w:lvl w:ilvl="1" w:tplc="04090019">
+      <w:start w:val="1"/>
+      <w:numFmt w:val="lowerLetter"/>
+      <w:lvlText w:val="%2)"/>
+      <w:lvlJc w:val="left"/>
+      <w:pPr>
+        <w:ind w:left="880" w:hanging="440"/>
+      </w:pPr>
+    </w:lvl>
+    <w:lvl w:ilvl="2" w:tplc="0409001B" w:tentative="1">
+      <w:start w:val="1"/>
+      <w:numFmt w:val="lowerRoman"/>
+      <w:lvlText w:val="%3."/>
+      <w:lvlJc w:val="right"/>
+      <w:pPr>
+        <w:ind w:left="1320" w:hanging="440"/>
+      </w:pPr>
+    </w:lvl>
+    <w:lvl w:ilvl="3" w:tplc="0409000F" w:tentative="1">
+      <w:start w:val="1"/>
+      <w:numFmt w:val="decimal"/>
+      <w:lvlText w:val="%4."/>
+      <w:lvlJc w:val="left"/>
+      <w:pPr>
+        <w:ind w:left="1760" w:hanging="440"/>
+      </w:pPr>
+    </w:lvl>
+    <w:lvl w:ilvl="4" w:tplc="04090019" w:tentative="1">
+      <w:start w:val="1"/>
+      <w:numFmt w:val="lowerLetter"/>
+      <w:lvlText w:val="%5)"/>
+      <w:lvlJc w:val="left"/>
+      <w:pPr>
+        <w:ind w:left="2200" w:hanging="440"/>
+      </w:pPr>
+    </w:lvl>
+    <w:lvl w:ilvl="5" w:tplc="0409001B" w:tentative="1">
+      <w:start w:val="1"/>
+      <w:numFmt w:val="lowerRoman"/>
+      <w:lvlText w:val="%6."/>
+      <w:lvlJc w:val="right"/>
+      <w:pPr>
+        <w:ind w:left="2640" w:hanging="440"/>
+      </w:pPr>
+    </w:lvl>
+    <w:lvl w:ilvl="6" w:tplc="0409000F" w:tentative="1">
+      <w:start w:val="1"/>
+      <w:numFmt w:val="decimal"/>
+      <w:lvlText w:val="%7."/>
+      <w:lvlJc w:val="left"/>
+      <w:pPr>
+        <w:ind w:left="3080" w:hanging="440"/>
+      </w:pPr>
+    </w:lvl>
+    <w:lvl w:ilvl="7" w:tplc="04090019" w:tentative="1">
+      <w:start w:val="1"/>
+      <w:numFmt w:val="lowerLetter"/>
+      <w:lvlText w:val="%8)"/>
+      <w:lvlJc w:val="left"/>
+      <w:pPr>
+        <w:ind w:left="3520" w:hanging="440"/>
+      </w:pPr>
+    </w:lvl>
+    <w:lvl w:ilvl="8" w:tplc="0409001B" w:tentative="1">
+      <w:start w:val="1"/>
+      <w:numFmt w:val="lowerRoman"/>
+      <w:lvlText w:val="%9."/>
+      <w:lvlJc w:val="right"/>
+      <w:pPr>
+        <w:ind w:left="3960" w:hanging="440"/>
+      </w:pPr>
+    </w:lvl>
+  </w:abstractNum>
+  <w:abstractNum w:abstractNumId="11" w15:restartNumberingAfterBreak="0">
     <w:nsid w:val="377D7CBB"/>
     <w:multiLevelType w:val="hybridMultilevel"/>
     <w:tmpl w:val="D92CE838"/>
@@ -5691,7 +5601,7 @@
       </w:rPr>
     </w:lvl>
   </w:abstractNum>
-  <w:abstractNum w:abstractNumId="11" w15:restartNumberingAfterBreak="0">
+  <w:abstractNum w:abstractNumId="12" w15:restartNumberingAfterBreak="0">
     <w:nsid w:val="3DA76ABD"/>
     <w:multiLevelType w:val="hybridMultilevel"/>
     <w:tmpl w:val="253A8CA2"/>
@@ -5804,7 +5714,7 @@
       </w:rPr>
     </w:lvl>
   </w:abstractNum>
-  <w:abstractNum w:abstractNumId="12" w15:restartNumberingAfterBreak="0">
+  <w:abstractNum w:abstractNumId="13" w15:restartNumberingAfterBreak="0">
     <w:nsid w:val="3F527C24"/>
     <w:multiLevelType w:val="hybridMultilevel"/>
     <w:tmpl w:val="63007FF6"/>
@@ -5917,7 +5827,7 @@
       </w:rPr>
     </w:lvl>
   </w:abstractNum>
-  <w:abstractNum w:abstractNumId="13" w15:restartNumberingAfterBreak="0">
+  <w:abstractNum w:abstractNumId="14" w15:restartNumberingAfterBreak="0">
     <w:nsid w:val="410238D2"/>
     <w:multiLevelType w:val="hybridMultilevel"/>
     <w:tmpl w:val="7D5EDD54"/>
@@ -6003,7 +5913,7 @@
       </w:pPr>
     </w:lvl>
   </w:abstractNum>
-  <w:abstractNum w:abstractNumId="14" w15:restartNumberingAfterBreak="0">
+  <w:abstractNum w:abstractNumId="15" w15:restartNumberingAfterBreak="0">
     <w:nsid w:val="41DD7F7F"/>
     <w:multiLevelType w:val="hybridMultilevel"/>
     <w:tmpl w:val="FEA4945E"/>
@@ -6116,7 +6026,7 @@
       </w:rPr>
     </w:lvl>
   </w:abstractNum>
-  <w:abstractNum w:abstractNumId="15" w15:restartNumberingAfterBreak="0">
+  <w:abstractNum w:abstractNumId="16" w15:restartNumberingAfterBreak="0">
     <w:nsid w:val="49854A9B"/>
     <w:multiLevelType w:val="hybridMultilevel"/>
     <w:tmpl w:val="D06AFC54"/>
@@ -6229,7 +6139,7 @@
       </w:rPr>
     </w:lvl>
   </w:abstractNum>
-  <w:abstractNum w:abstractNumId="16" w15:restartNumberingAfterBreak="0">
+  <w:abstractNum w:abstractNumId="17" w15:restartNumberingAfterBreak="0">
     <w:nsid w:val="4C481A9B"/>
     <w:multiLevelType w:val="hybridMultilevel"/>
     <w:tmpl w:val="6FE8BB60"/>
@@ -6318,7 +6228,96 @@
       </w:pPr>
     </w:lvl>
   </w:abstractNum>
-  <w:abstractNum w:abstractNumId="17" w15:restartNumberingAfterBreak="0">
+  <w:abstractNum w:abstractNumId="18" w15:restartNumberingAfterBreak="0">
+    <w:nsid w:val="4E94479D"/>
+    <w:multiLevelType w:val="hybridMultilevel"/>
+    <w:tmpl w:val="72500BC6"/>
+    <w:lvl w:ilvl="0" w:tplc="37EE192E">
+      <w:start w:val="1"/>
+      <w:numFmt w:val="decimal"/>
+      <w:lvlText w:val="%1."/>
+      <w:lvlJc w:val="left"/>
+      <w:pPr>
+        <w:ind w:left="360" w:hanging="360"/>
+      </w:pPr>
+      <w:rPr>
+        <w:rFonts w:hint="default"/>
+      </w:rPr>
+    </w:lvl>
+    <w:lvl w:ilvl="1" w:tplc="04090019" w:tentative="1">
+      <w:start w:val="1"/>
+      <w:numFmt w:val="lowerLetter"/>
+      <w:lvlText w:val="%2)"/>
+      <w:lvlJc w:val="left"/>
+      <w:pPr>
+        <w:ind w:left="880" w:hanging="440"/>
+      </w:pPr>
+    </w:lvl>
+    <w:lvl w:ilvl="2" w:tplc="0409001B" w:tentative="1">
+      <w:start w:val="1"/>
+      <w:numFmt w:val="lowerRoman"/>
+      <w:lvlText w:val="%3."/>
+      <w:lvlJc w:val="right"/>
+      <w:pPr>
+        <w:ind w:left="1320" w:hanging="440"/>
+      </w:pPr>
+    </w:lvl>
+    <w:lvl w:ilvl="3" w:tplc="0409000F" w:tentative="1">
+      <w:start w:val="1"/>
+      <w:numFmt w:val="decimal"/>
+      <w:lvlText w:val="%4."/>
+      <w:lvlJc w:val="left"/>
+      <w:pPr>
+        <w:ind w:left="1760" w:hanging="440"/>
+      </w:pPr>
+    </w:lvl>
+    <w:lvl w:ilvl="4" w:tplc="04090019" w:tentative="1">
+      <w:start w:val="1"/>
+      <w:numFmt w:val="lowerLetter"/>
+      <w:lvlText w:val="%5)"/>
+      <w:lvlJc w:val="left"/>
+      <w:pPr>
+        <w:ind w:left="2200" w:hanging="440"/>
+      </w:pPr>
+    </w:lvl>
+    <w:lvl w:ilvl="5" w:tplc="0409001B" w:tentative="1">
+      <w:start w:val="1"/>
+      <w:numFmt w:val="lowerRoman"/>
+      <w:lvlText w:val="%6."/>
+      <w:lvlJc w:val="right"/>
+      <w:pPr>
+        <w:ind w:left="2640" w:hanging="440"/>
+      </w:pPr>
+    </w:lvl>
+    <w:lvl w:ilvl="6" w:tplc="0409000F" w:tentative="1">
+      <w:start w:val="1"/>
+      <w:numFmt w:val="decimal"/>
+      <w:lvlText w:val="%7."/>
+      <w:lvlJc w:val="left"/>
+      <w:pPr>
+        <w:ind w:left="3080" w:hanging="440"/>
+      </w:pPr>
+    </w:lvl>
+    <w:lvl w:ilvl="7" w:tplc="04090019" w:tentative="1">
+      <w:start w:val="1"/>
+      <w:numFmt w:val="lowerLetter"/>
+      <w:lvlText w:val="%8)"/>
+      <w:lvlJc w:val="left"/>
+      <w:pPr>
+        <w:ind w:left="3520" w:hanging="440"/>
+      </w:pPr>
+    </w:lvl>
+    <w:lvl w:ilvl="8" w:tplc="0409001B" w:tentative="1">
+      <w:start w:val="1"/>
+      <w:numFmt w:val="lowerRoman"/>
+      <w:lvlText w:val="%9."/>
+      <w:lvlJc w:val="right"/>
+      <w:pPr>
+        <w:ind w:left="3960" w:hanging="440"/>
+      </w:pPr>
+    </w:lvl>
+  </w:abstractNum>
+  <w:abstractNum w:abstractNumId="19" w15:restartNumberingAfterBreak="0">
     <w:nsid w:val="50A87C8F"/>
     <w:multiLevelType w:val="hybridMultilevel"/>
     <w:tmpl w:val="B734D494"/>
@@ -6431,7 +6430,7 @@
       </w:rPr>
     </w:lvl>
   </w:abstractNum>
-  <w:abstractNum w:abstractNumId="18" w15:restartNumberingAfterBreak="0">
+  <w:abstractNum w:abstractNumId="20" w15:restartNumberingAfterBreak="0">
     <w:nsid w:val="52BA014D"/>
     <w:multiLevelType w:val="hybridMultilevel"/>
     <w:tmpl w:val="059CA852"/>
@@ -6544,7 +6543,7 @@
       </w:rPr>
     </w:lvl>
   </w:abstractNum>
-  <w:abstractNum w:abstractNumId="19" w15:restartNumberingAfterBreak="0">
+  <w:abstractNum w:abstractNumId="21" w15:restartNumberingAfterBreak="0">
     <w:nsid w:val="578266EF"/>
     <w:multiLevelType w:val="hybridMultilevel"/>
     <w:tmpl w:val="452E6610"/>
@@ -6657,7 +6656,7 @@
       </w:rPr>
     </w:lvl>
   </w:abstractNum>
-  <w:abstractNum w:abstractNumId="20" w15:restartNumberingAfterBreak="0">
+  <w:abstractNum w:abstractNumId="22" w15:restartNumberingAfterBreak="0">
     <w:nsid w:val="58364D53"/>
     <w:multiLevelType w:val="hybridMultilevel"/>
     <w:tmpl w:val="5E6CA9D2"/>
@@ -6770,7 +6769,7 @@
       </w:rPr>
     </w:lvl>
   </w:abstractNum>
-  <w:abstractNum w:abstractNumId="21" w15:restartNumberingAfterBreak="0">
+  <w:abstractNum w:abstractNumId="23" w15:restartNumberingAfterBreak="0">
     <w:nsid w:val="58905240"/>
     <w:multiLevelType w:val="hybridMultilevel"/>
     <w:tmpl w:val="5F80453A"/>
@@ -6883,7 +6882,7 @@
       </w:rPr>
     </w:lvl>
   </w:abstractNum>
-  <w:abstractNum w:abstractNumId="22" w15:restartNumberingAfterBreak="0">
+  <w:abstractNum w:abstractNumId="24" w15:restartNumberingAfterBreak="0">
     <w:nsid w:val="58A751F9"/>
     <w:multiLevelType w:val="hybridMultilevel"/>
     <w:tmpl w:val="F0385ADC"/>
@@ -6996,7 +6995,7 @@
       </w:rPr>
     </w:lvl>
   </w:abstractNum>
-  <w:abstractNum w:abstractNumId="23" w15:restartNumberingAfterBreak="0">
+  <w:abstractNum w:abstractNumId="25" w15:restartNumberingAfterBreak="0">
     <w:nsid w:val="59EC0B82"/>
     <w:multiLevelType w:val="hybridMultilevel"/>
     <w:tmpl w:val="7B840A3A"/>
@@ -7082,7 +7081,7 @@
       </w:pPr>
     </w:lvl>
   </w:abstractNum>
-  <w:abstractNum w:abstractNumId="24" w15:restartNumberingAfterBreak="0">
+  <w:abstractNum w:abstractNumId="26" w15:restartNumberingAfterBreak="0">
     <w:nsid w:val="72BC5608"/>
     <w:multiLevelType w:val="hybridMultilevel"/>
     <w:tmpl w:val="92B24552"/>
@@ -7195,7 +7194,7 @@
       </w:rPr>
     </w:lvl>
   </w:abstractNum>
-  <w:abstractNum w:abstractNumId="25" w15:restartNumberingAfterBreak="0">
+  <w:abstractNum w:abstractNumId="27" w15:restartNumberingAfterBreak="0">
     <w:nsid w:val="739A1D7E"/>
     <w:multiLevelType w:val="hybridMultilevel"/>
     <w:tmpl w:val="4B2AF1E2"/>
@@ -7281,7 +7280,96 @@
       </w:pPr>
     </w:lvl>
   </w:abstractNum>
-  <w:abstractNum w:abstractNumId="26" w15:restartNumberingAfterBreak="0">
+  <w:abstractNum w:abstractNumId="28" w15:restartNumberingAfterBreak="0">
+    <w:nsid w:val="74D675C8"/>
+    <w:multiLevelType w:val="hybridMultilevel"/>
+    <w:tmpl w:val="EF948376"/>
+    <w:lvl w:ilvl="0" w:tplc="451EFB4A">
+      <w:start w:val="1"/>
+      <w:numFmt w:val="decimal"/>
+      <w:lvlText w:val="%1."/>
+      <w:lvlJc w:val="left"/>
+      <w:pPr>
+        <w:ind w:left="360" w:hanging="360"/>
+      </w:pPr>
+      <w:rPr>
+        <w:rFonts w:hint="default"/>
+      </w:rPr>
+    </w:lvl>
+    <w:lvl w:ilvl="1" w:tplc="04090019" w:tentative="1">
+      <w:start w:val="1"/>
+      <w:numFmt w:val="lowerLetter"/>
+      <w:lvlText w:val="%2)"/>
+      <w:lvlJc w:val="left"/>
+      <w:pPr>
+        <w:ind w:left="880" w:hanging="440"/>
+      </w:pPr>
+    </w:lvl>
+    <w:lvl w:ilvl="2" w:tplc="0409001B" w:tentative="1">
+      <w:start w:val="1"/>
+      <w:numFmt w:val="lowerRoman"/>
+      <w:lvlText w:val="%3."/>
+      <w:lvlJc w:val="right"/>
+      <w:pPr>
+        <w:ind w:left="1320" w:hanging="440"/>
+      </w:pPr>
+    </w:lvl>
+    <w:lvl w:ilvl="3" w:tplc="0409000F" w:tentative="1">
+      <w:start w:val="1"/>
+      <w:numFmt w:val="decimal"/>
+      <w:lvlText w:val="%4."/>
+      <w:lvlJc w:val="left"/>
+      <w:pPr>
+        <w:ind w:left="1760" w:hanging="440"/>
+      </w:pPr>
+    </w:lvl>
+    <w:lvl w:ilvl="4" w:tplc="04090019" w:tentative="1">
+      <w:start w:val="1"/>
+      <w:numFmt w:val="lowerLetter"/>
+      <w:lvlText w:val="%5)"/>
+      <w:lvlJc w:val="left"/>
+      <w:pPr>
+        <w:ind w:left="2200" w:hanging="440"/>
+      </w:pPr>
+    </w:lvl>
+    <w:lvl w:ilvl="5" w:tplc="0409001B" w:tentative="1">
+      <w:start w:val="1"/>
+      <w:numFmt w:val="lowerRoman"/>
+      <w:lvlText w:val="%6."/>
+      <w:lvlJc w:val="right"/>
+      <w:pPr>
+        <w:ind w:left="2640" w:hanging="440"/>
+      </w:pPr>
+    </w:lvl>
+    <w:lvl w:ilvl="6" w:tplc="0409000F" w:tentative="1">
+      <w:start w:val="1"/>
+      <w:numFmt w:val="decimal"/>
+      <w:lvlText w:val="%7."/>
+      <w:lvlJc w:val="left"/>
+      <w:pPr>
+        <w:ind w:left="3080" w:hanging="440"/>
+      </w:pPr>
+    </w:lvl>
+    <w:lvl w:ilvl="7" w:tplc="04090019" w:tentative="1">
+      <w:start w:val="1"/>
+      <w:numFmt w:val="lowerLetter"/>
+      <w:lvlText w:val="%8)"/>
+      <w:lvlJc w:val="left"/>
+      <w:pPr>
+        <w:ind w:left="3520" w:hanging="440"/>
+      </w:pPr>
+    </w:lvl>
+    <w:lvl w:ilvl="8" w:tplc="0409001B" w:tentative="1">
+      <w:start w:val="1"/>
+      <w:numFmt w:val="lowerRoman"/>
+      <w:lvlText w:val="%9."/>
+      <w:lvlJc w:val="right"/>
+      <w:pPr>
+        <w:ind w:left="3960" w:hanging="440"/>
+      </w:pPr>
+    </w:lvl>
+  </w:abstractNum>
+  <w:abstractNum w:abstractNumId="29" w15:restartNumberingAfterBreak="0">
     <w:nsid w:val="76240879"/>
     <w:multiLevelType w:val="hybridMultilevel"/>
     <w:tmpl w:val="99B0A23E"/>
@@ -7370,7 +7458,7 @@
       </w:pPr>
     </w:lvl>
   </w:abstractNum>
-  <w:abstractNum w:abstractNumId="27" w15:restartNumberingAfterBreak="0">
+  <w:abstractNum w:abstractNumId="30" w15:restartNumberingAfterBreak="0">
     <w:nsid w:val="7B9E2400"/>
     <w:multiLevelType w:val="hybridMultilevel"/>
     <w:tmpl w:val="DC261894"/>
@@ -7460,31 +7548,31 @@
     </w:lvl>
   </w:abstractNum>
   <w:num w:numId="1" w16cid:durableId="273175726">
-    <w:abstractNumId w:val="23"/>
+    <w:abstractNumId w:val="25"/>
   </w:num>
   <w:num w:numId="2" w16cid:durableId="68813729">
-    <w:abstractNumId w:val="16"/>
+    <w:abstractNumId w:val="17"/>
   </w:num>
   <w:num w:numId="3" w16cid:durableId="758448871">
     <w:abstractNumId w:val="4"/>
   </w:num>
   <w:num w:numId="4" w16cid:durableId="1356809263">
-    <w:abstractNumId w:val="27"/>
+    <w:abstractNumId w:val="30"/>
   </w:num>
   <w:num w:numId="5" w16cid:durableId="1399938543">
-    <w:abstractNumId w:val="24"/>
+    <w:abstractNumId w:val="26"/>
   </w:num>
   <w:num w:numId="6" w16cid:durableId="1343320405">
     <w:abstractNumId w:val="0"/>
   </w:num>
   <w:num w:numId="7" w16cid:durableId="928276040">
-    <w:abstractNumId w:val="10"/>
+    <w:abstractNumId w:val="11"/>
   </w:num>
   <w:num w:numId="8" w16cid:durableId="1842502449">
-    <w:abstractNumId w:val="11"/>
+    <w:abstractNumId w:val="12"/>
   </w:num>
   <w:num w:numId="9" w16cid:durableId="711883729">
-    <w:abstractNumId w:val="15"/>
+    <w:abstractNumId w:val="16"/>
   </w:num>
   <w:num w:numId="10" w16cid:durableId="2113012709">
     <w:abstractNumId w:val="3"/>
@@ -7493,16 +7581,16 @@
     <w:abstractNumId w:val="1"/>
   </w:num>
   <w:num w:numId="12" w16cid:durableId="2126734494">
-    <w:abstractNumId w:val="21"/>
+    <w:abstractNumId w:val="23"/>
   </w:num>
   <w:num w:numId="13" w16cid:durableId="24719428">
-    <w:abstractNumId w:val="17"/>
+    <w:abstractNumId w:val="19"/>
   </w:num>
   <w:num w:numId="14" w16cid:durableId="1488860246">
     <w:abstractNumId w:val="2"/>
   </w:num>
   <w:num w:numId="15" w16cid:durableId="1882665378">
-    <w:abstractNumId w:val="26"/>
+    <w:abstractNumId w:val="29"/>
   </w:num>
   <w:num w:numId="16" w16cid:durableId="1322806903">
     <w:abstractNumId w:val="7"/>
@@ -7511,37 +7599,46 @@
     <w:abstractNumId w:val="9"/>
   </w:num>
   <w:num w:numId="18" w16cid:durableId="944115501">
-    <w:abstractNumId w:val="18"/>
+    <w:abstractNumId w:val="20"/>
   </w:num>
   <w:num w:numId="19" w16cid:durableId="1654531269">
-    <w:abstractNumId w:val="13"/>
+    <w:abstractNumId w:val="14"/>
   </w:num>
   <w:num w:numId="20" w16cid:durableId="1245186092">
     <w:abstractNumId w:val="8"/>
   </w:num>
   <w:num w:numId="21" w16cid:durableId="1176381577">
-    <w:abstractNumId w:val="14"/>
+    <w:abstractNumId w:val="15"/>
   </w:num>
   <w:num w:numId="22" w16cid:durableId="98795386">
-    <w:abstractNumId w:val="12"/>
+    <w:abstractNumId w:val="13"/>
   </w:num>
   <w:num w:numId="23" w16cid:durableId="840319976">
-    <w:abstractNumId w:val="20"/>
+    <w:abstractNumId w:val="22"/>
   </w:num>
   <w:num w:numId="24" w16cid:durableId="471673539">
     <w:abstractNumId w:val="5"/>
   </w:num>
   <w:num w:numId="25" w16cid:durableId="1101802340">
-    <w:abstractNumId w:val="22"/>
+    <w:abstractNumId w:val="24"/>
   </w:num>
   <w:num w:numId="26" w16cid:durableId="1580476617">
-    <w:abstractNumId w:val="19"/>
+    <w:abstractNumId w:val="21"/>
   </w:num>
   <w:num w:numId="27" w16cid:durableId="1799226548">
     <w:abstractNumId w:val="6"/>
   </w:num>
   <w:num w:numId="28" w16cid:durableId="1167406946">
-    <w:abstractNumId w:val="25"/>
+    <w:abstractNumId w:val="27"/>
+  </w:num>
+  <w:num w:numId="29" w16cid:durableId="231738375">
+    <w:abstractNumId w:val="18"/>
+  </w:num>
+  <w:num w:numId="30" w16cid:durableId="41026119">
+    <w:abstractNumId w:val="10"/>
+  </w:num>
+  <w:num w:numId="31" w16cid:durableId="1418554172">
+    <w:abstractNumId w:val="28"/>
   </w:num>
 </w:numbering>
 </file>
@@ -8150,6 +8247,7 @@
   <w:style w:type="character" w:default="1" w:styleId="a0">
     <w:name w:val="Default Paragraph Font"/>
     <w:uiPriority w:val="1"/>
+    <w:semiHidden/>
     <w:unhideWhenUsed/>
   </w:style>
   <w:style w:type="table" w:default="1" w:styleId="a1">

</xml_diff>